<commit_message>
docs(mcp): scrub the DoDAAC method from the whitepaper (protect tradecraft)
Sell the OUTCOME (office-precise contacts vs the whole-department firehose) without
disclosing the mechanism. Removed "anchors on the 6-character DoDAAC that prefixes
every solicitation number" + all "DoDAAC-anchored" labels; retitled the section
"Office-level precision — the buying office beneath the department label". Keeps the
W912PL / USACE-LA-District proof and the differentiation, drops the how-to. Regenerated
the .docx (verified: no "DoDAAC"/"prefix" strings remain).

Co-Authored-By: Claude Opus 4.8 (1M context) <noreply@anthropic.com>
</commit_message>
<xml_diff>
--- a/docs/marketing/Mindy-MCP-Whitepaper.docx
+++ b/docs/marketing/Mindy-MCP-Whitepaper.docx
@@ -338,7 +338,7 @@
           <w:sz w:val="21"/>
           <w:szCs w:val="21"/>
         </w:rPr>
-        <w:t xml:space="preserve">DoDAAC-anchored buying-office contacts</w:t>
+        <w:t xml:space="preserve">Office-level buying contacts</w:t>
       </w:r>
       <w:r>
         <w:rPr>
@@ -1963,7 +1963,7 @@
                 <w:sz w:val="19"/>
                 <w:szCs w:val="19"/>
               </w:rPr>
-              <w:t xml:space="preserve">Named POCs at a buying office, DoDAAC-anchored</w:t>
+              <w:t xml:space="preserve">Named POCs at a specific buying office</w:t>
             </w:r>
           </w:p>
         </w:tc>
@@ -2642,7 +2642,7 @@
           <w:sz w:val="28"/>
           <w:szCs w:val="28"/>
         </w:rPr>
-        <w:t xml:space="preserve">The DoDAAC anchor — the precision competitors miss</w:t>
+        <w:t xml:space="preserve">Office-level precision — the buying office beneath the department label</w:t>
       </w:r>
     </w:p>
     <w:p>
@@ -2687,7 +2687,7 @@
           <w:sz w:val="21"/>
           <w:szCs w:val="21"/>
         </w:rPr>
-        <w:t xml:space="preserve">Mindy anchors on the </w:t>
+        <w:t xml:space="preserve">Mindy resolves the </w:t>
       </w:r>
       <w:r>
         <w:rPr>
@@ -2697,15 +2697,33 @@
           <w:sz w:val="21"/>
           <w:szCs w:val="21"/>
         </w:rPr>
-        <w:t xml:space="preserve">6-character DoDAAC</w:t>
-      </w:r>
-      <w:r>
-        <w:rPr>
-          <w:color w:val="1f2937"/>
-          <w:sz w:val="21"/>
-          <w:szCs w:val="21"/>
-        </w:rPr>
-        <w:t xml:space="preserve"> that prefixes every solicitation number. </w:t>
+        <w:t xml:space="preserve">real buying office</w:t>
+      </w:r>
+      <w:r>
+        <w:rPr>
+          <w:color w:val="1f2937"/>
+          <w:sz w:val="21"/>
+          <w:szCs w:val="21"/>
+        </w:rPr>
+        <w:t xml:space="preserve"> beneath that label. Ask for the contacts at the Army Corps of Engineers Los Angeles District and Mindy returns </w:t>
+      </w:r>
+      <w:r>
+        <w:rPr>
+          <w:i/>
+          <w:iCs/>
+          <w:color w:val="1f2937"/>
+          <w:sz w:val="21"/>
+          <w:szCs w:val="21"/>
+        </w:rPr>
+        <w:t xml:space="preserve">that office's own</w:t>
+      </w:r>
+      <w:r>
+        <w:rPr>
+          <w:color w:val="1f2937"/>
+          <w:sz w:val="21"/>
+          <w:szCs w:val="21"/>
+        </w:rPr>
+        <w:t xml:space="preserve"> people — eleven </w:t>
       </w:r>
       <w:r>
         <w:rPr>
@@ -2714,41 +2732,6 @@
           <w:sz w:val="21"/>
           <w:szCs w:val="21"/>
         </w:rPr>
-        <w:t xml:space="preserve">W912PL</w:t>
-      </w:r>
-      <w:r>
-        <w:rPr>
-          <w:color w:val="1f2937"/>
-          <w:sz w:val="21"/>
-          <w:szCs w:val="21"/>
-        </w:rPr>
-        <w:t xml:space="preserve"> is the Army Corps of Engineers Los Angeles District. Ask for its contacts and Mindy returns </w:t>
-      </w:r>
-      <w:r>
-        <w:rPr>
-          <w:i/>
-          <w:iCs/>
-          <w:color w:val="1f2937"/>
-          <w:sz w:val="21"/>
-          <w:szCs w:val="21"/>
-        </w:rPr>
-        <w:t xml:space="preserve">that office's own</w:t>
-      </w:r>
-      <w:r>
-        <w:rPr>
-          <w:color w:val="1f2937"/>
-          <w:sz w:val="21"/>
-          <w:szCs w:val="21"/>
-        </w:rPr>
-        <w:t xml:space="preserve"> people — eleven </w:t>
-      </w:r>
-      <w:r>
-        <w:rPr>
-          <w:rFonts w:ascii="Consolas" w:cs="Consolas" w:eastAsia="Consolas" w:hAnsi="Consolas"/>
-          <w:color w:val="6d28d9"/>
-          <w:sz w:val="21"/>
-          <w:szCs w:val="21"/>
-        </w:rPr>
         <w:t xml:space="preserve">@usace.army.mil</w:t>
       </w:r>
       <w:r>
@@ -2757,7 +2740,7 @@
           <w:sz w:val="21"/>
           <w:szCs w:val="21"/>
         </w:rPr>
-        <w:t xml:space="preserve"> engineers with real email addresses — plus its eleven open solicitations, not the department-wide flood. That's the difference between "we wrap the API" and "we know how federal buying actually works."</w:t>
+        <w:t xml:space="preserve"> engineers with real email addresses — plus its eleven open solicitations, not the department-wide flood. That precision comes from understanding how federal buying is actually structured, and it's the difference between "we wrap the API" and "we know how the money is actually spent."</w:t>
       </w:r>
     </w:p>
     <w:p>
@@ -3905,7 +3888,7 @@
           <w:sz w:val="21"/>
           <w:szCs w:val="21"/>
         </w:rPr>
-        <w:t xml:space="preserve"> — winning playbooks, DoDAAC-anchored contacts, SBLO teaming, and podcast lessons that took eight years to build.</w:t>
+        <w:t xml:space="preserve"> — winning playbooks, office-level buying contacts, SBLO teaming, and podcast lessons that took eight years to build.</w:t>
       </w:r>
     </w:p>
     <w:p>

</xml_diff>

<commit_message>
feat(mcp): capability_market_match — combination tool #1 of 8
'Where do I fit?' in one call. Chains derive_company_keywords → keyword-coverage →
(market vocabulary · top competitors · upcoming forecasts · expiring/recompete opps)
into one addressable-market read — the onboarding reveal. Orchestrates existing
atomic tools (no new data engine), each guarded (honest-miss, never fabricate),
_meta always ships. Priced 100 (combination tier). Catalog synced to 50 tools
across all surfaces; registered in tool-registry (def + dispatch + credits + meta).

First of the 8-combo roadmap (pursuit dossier, one-click proposal, recompete attack
list, competitor war room, teaming package, agency account plan, sources-sought kit).

Co-Authored-By: Claude Opus 4.8 (1M context) <noreply@anthropic.com>
</commit_message>
<xml_diff>
--- a/docs/marketing/Mindy-MCP-Whitepaper.docx
+++ b/docs/marketing/Mindy-MCP-Whitepaper.docx
@@ -324,7 +324,7 @@
         <w:rPr>
           <w:color w:val="5B34D6"/>
         </w:rPr>
-        <w:t xml:space="preserve">What Mindy MCP gives an agent — 40 tools across four layers</w:t>
+        <w:t xml:space="preserve">What Mindy MCP gives an agent — 50 tools across four layers</w:t>
       </w:r>
     </w:p>
     <w:p>
@@ -4275,7 +4275,7 @@
           <w:b/>
           <w:bCs/>
         </w:rPr>
-        <w:t xml:space="preserve">40 tools</w:t>
+        <w:t xml:space="preserve">50 tools</w:t>
       </w:r>
       <w:r>
         <w:t xml:space="preserve"> spanning the public data any agent needs, a full proposal pipeline, and the proprietary intelligence no competitor can copy, all under a contract that returns real data or honestly returns nothing.</w:t>

</xml_diff>

<commit_message>
feat(mcp): capability_market_match — combination tool #1 of 8 (#404)
'Where do I fit?' in one call. Chains derive_company_keywords → keyword-coverage →
(market vocabulary · top competitors · upcoming forecasts · expiring/recompete opps)
into one addressable-market read — the onboarding reveal. Orchestrates existing
atomic tools (no new data engine), each guarded (honest-miss, never fabricate),
_meta always ships. Priced 100 (combination tier). Catalog synced to 50 tools
across all surfaces; registered in tool-registry (def + dispatch + credits + meta).

First of the 8-combo roadmap (pursuit dossier, one-click proposal, recompete attack
list, competitor war room, teaming package, agency account plan, sources-sought kit).

Co-authored-by: Claude Opus 4.8 (1M context) <noreply@anthropic.com>
</commit_message>
<xml_diff>
--- a/docs/marketing/Mindy-MCP-Whitepaper.docx
+++ b/docs/marketing/Mindy-MCP-Whitepaper.docx
@@ -324,7 +324,7 @@
         <w:rPr>
           <w:color w:val="5B34D6"/>
         </w:rPr>
-        <w:t xml:space="preserve">What Mindy MCP gives an agent — 40 tools across four layers</w:t>
+        <w:t xml:space="preserve">What Mindy MCP gives an agent — 50 tools across four layers</w:t>
       </w:r>
     </w:p>
     <w:p>
@@ -4275,7 +4275,7 @@
           <w:b/>
           <w:bCs/>
         </w:rPr>
-        <w:t xml:space="preserve">40 tools</w:t>
+        <w:t xml:space="preserve">50 tools</w:t>
       </w:r>
       <w:r>
         <w:t xml:space="preserve"> spanning the public data any agent needs, a full proposal pipeline, and the proprietary intelligence no competitor can copy, all under a contract that returns real data or honestly returns nothing.</w:t>

</xml_diff>

<commit_message>
feat(mcp): build_pursuit_dossier — the capture package on one opportunity (combo, highest-value)
Paste a solicitation number → a full should-I-bid + how-to-win dossier in one call.
Anchors on get_solicitation_incumbent (resolves notice + likely incumbent + NAICS/
agency), then guarded parallel fan-out to: solicitation docs · market depth (Rule of
Two) · price-to-win · buying-office contacts · incumbent financials. A capture
manager's day of research in one deliverable. Orchestrates existing tools (no new
data engine), honest-miss, _meta always ships. Priced 100 (combination tier).
Catalog synced to 51 across all 4 surfaces.

2nd combo shipped (prioritized by value per Eric). Next: One-Click Proposal.

Co-Authored-By: Claude Opus 4.8 (1M context) <noreply@anthropic.com>
</commit_message>
<xml_diff>
--- a/docs/marketing/Mindy-MCP-Whitepaper.docx
+++ b/docs/marketing/Mindy-MCP-Whitepaper.docx
@@ -324,7 +324,7 @@
         <w:rPr>
           <w:color w:val="5B34D6"/>
         </w:rPr>
-        <w:t xml:space="preserve">What Mindy MCP gives an agent — 50 tools across four layers</w:t>
+        <w:t xml:space="preserve">What Mindy MCP gives an agent — 51 tools across four layers</w:t>
       </w:r>
     </w:p>
     <w:p>
@@ -4275,7 +4275,7 @@
           <w:b/>
           <w:bCs/>
         </w:rPr>
-        <w:t xml:space="preserve">50 tools</w:t>
+        <w:t xml:space="preserve">51 tools</w:t>
       </w:r>
       <w:r>
         <w:t xml:space="preserve"> spanning the public data any agent needs, a full proposal pipeline, and the proprietary intelligence no competitor can copy, all under a contract that returns real data or honestly returns nothing.</w:t>

</xml_diff>

<commit_message>
feat(mcp): build_pursuit_dossier — the capture package on one opportunity (combo, highest-value) (#405)
Paste a solicitation number → a full should-I-bid + how-to-win dossier in one call.
Anchors on get_solicitation_incumbent (resolves notice + likely incumbent + NAICS/
agency), then guarded parallel fan-out to: solicitation docs · market depth (Rule of
Two) · price-to-win · buying-office contacts · incumbent financials. A capture
manager's day of research in one deliverable. Orchestrates existing tools (no new
data engine), honest-miss, _meta always ships. Priced 100 (combination tier).
Catalog synced to 51 across all 4 surfaces.

2nd combo shipped (prioritized by value per Eric). Next: One-Click Proposal.

Co-authored-by: Claude Opus 4.8 (1M context) <noreply@anthropic.com>
</commit_message>
<xml_diff>
--- a/docs/marketing/Mindy-MCP-Whitepaper.docx
+++ b/docs/marketing/Mindy-MCP-Whitepaper.docx
@@ -324,7 +324,7 @@
         <w:rPr>
           <w:color w:val="5B34D6"/>
         </w:rPr>
-        <w:t xml:space="preserve">What Mindy MCP gives an agent — 50 tools across four layers</w:t>
+        <w:t xml:space="preserve">What Mindy MCP gives an agent — 51 tools across four layers</w:t>
       </w:r>
     </w:p>
     <w:p>
@@ -4275,7 +4275,7 @@
           <w:b/>
           <w:bCs/>
         </w:rPr>
-        <w:t xml:space="preserve">50 tools</w:t>
+        <w:t xml:space="preserve">51 tools</w:t>
       </w:r>
       <w:r>
         <w:t xml:space="preserve"> spanning the public data any agent needs, a full proposal pipeline, and the proprietary intelligence no competitor can copy, all under a contract that returns real data or honestly returns nothing.</w:t>

</xml_diff>

<commit_message>
feat(mcp): one_click_proposal — solicitation in, submittable .docx out (combo, top-ticket)
Runs the ENTIRE proposal pipeline in one call: extract_compliance_matrix →
build_proposal_structure → draft_proposal → referee_proposal_compliance →
export_proposal. Returns the matrix, outline, full multi-section draft, an
independent compliance score (met/partial/missing), and the assembled Word .docx
as base64. Heaviest tool in the catalog (multiple LLM passes) — replaces the
$3,500-7,500 proposal effort. Each stage guarded/honest-miss; _meta always ships.

Priced 200 — introduces the top tier above the 100 combinations (real LLM cost +
the finished deliverable). Catalog synced to 52 across all 4 surfaces.

3rd combo shipped (value order). Roadmap remaining: recompete attack list,
competitor war room, agency account plan, teaming package, sources-sought kit.

Co-Authored-By: Claude Opus 4.8 (1M context) <noreply@anthropic.com>
</commit_message>
<xml_diff>
--- a/docs/marketing/Mindy-MCP-Whitepaper.docx
+++ b/docs/marketing/Mindy-MCP-Whitepaper.docx
@@ -324,7 +324,7 @@
         <w:rPr>
           <w:color w:val="5B34D6"/>
         </w:rPr>
-        <w:t xml:space="preserve">What Mindy MCP gives an agent — 51 tools across four layers</w:t>
+        <w:t xml:space="preserve">What Mindy MCP gives an agent — 52 tools across four layers</w:t>
       </w:r>
     </w:p>
     <w:p>
@@ -4275,7 +4275,7 @@
           <w:b/>
           <w:bCs/>
         </w:rPr>
-        <w:t xml:space="preserve">51 tools</w:t>
+        <w:t xml:space="preserve">52 tools</w:t>
       </w:r>
       <w:r>
         <w:t xml:space="preserve"> spanning the public data any agent needs, a full proposal pipeline, and the proprietary intelligence no competitor can copy, all under a contract that returns real data or honestly returns nothing.</w:t>

</xml_diff>

<commit_message>
feat(mcp): one_click_proposal — solicitation in, submittable .docx out (combo, top-ticket) (#406)
Runs the ENTIRE proposal pipeline in one call: extract_compliance_matrix →
build_proposal_structure → draft_proposal → referee_proposal_compliance →
export_proposal. Returns the matrix, outline, full multi-section draft, an
independent compliance score (met/partial/missing), and the assembled Word .docx
as base64. Heaviest tool in the catalog (multiple LLM passes) — replaces the
$3,500-7,500 proposal effort. Each stage guarded/honest-miss; _meta always ships.

Priced 200 — introduces the top tier above the 100 combinations (real LLM cost +
the finished deliverable). Catalog synced to 52 across all 4 surfaces.

3rd combo shipped (value order). Roadmap remaining: recompete attack list,
competitor war room, agency account plan, teaming package, sources-sought kit.

Co-authored-by: Claude Opus 4.8 (1M context) <noreply@anthropic.com>
</commit_message>
<xml_diff>
--- a/docs/marketing/Mindy-MCP-Whitepaper.docx
+++ b/docs/marketing/Mindy-MCP-Whitepaper.docx
@@ -324,7 +324,7 @@
         <w:rPr>
           <w:color w:val="5B34D6"/>
         </w:rPr>
-        <w:t xml:space="preserve">What Mindy MCP gives an agent — 51 tools across four layers</w:t>
+        <w:t xml:space="preserve">What Mindy MCP gives an agent — 52 tools across four layers</w:t>
       </w:r>
     </w:p>
     <w:p>
@@ -4275,7 +4275,7 @@
           <w:b/>
           <w:bCs/>
         </w:rPr>
-        <w:t xml:space="preserve">51 tools</w:t>
+        <w:t xml:space="preserve">52 tools</w:t>
       </w:r>
       <w:r>
         <w:t xml:space="preserve"> spanning the public data any agent needs, a full proposal pipeline, and the proprietary intelligence no competitor can copy, all under a contract that returns real data or honestly returns nothing.</w:t>

</xml_diff>